<commit_message>
adding 3rd project, compress the CV and more
</commit_message>
<xml_diff>
--- a/Rayyan_Ahmed_Khan_CV.docx
+++ b/Rayyan_Ahmed_Khan_CV.docx
@@ -23,12 +23,6 @@
         <w:gridCol w:w="10080"/>
       </w:tblGrid>
       <w:tr>
-        <w:tblPrEx>
-          <w:tblCellMar>
-            <w:top w:w="0" w:type="dxa"/>
-            <w:bottom w:w="0" w:type="dxa"/>
-          </w:tblCellMar>
-        </w:tblPrEx>
         <w:tc>
           <w:tcPr>
             <w:tcW w:w="0" w:type="auto"/>
@@ -80,12 +74,6 @@
         </w:tc>
       </w:tr>
       <w:tr>
-        <w:tblPrEx>
-          <w:tblCellMar>
-            <w:top w:w="0" w:type="dxa"/>
-            <w:bottom w:w="0" w:type="dxa"/>
-          </w:tblCellMar>
-        </w:tblPrEx>
         <w:tc>
           <w:tcPr>
             <w:tcW w:w="0" w:type="auto"/>
@@ -114,16 +102,7 @@
                 <w:sz w:val="18"/>
                 <w:szCs w:val="18"/>
               </w:rPr>
-              <w:t>Rayan45ahmed.khan</w:t>
-            </w:r>
-            <w:r>
-              <w:rPr>
-                <w:rFonts w:ascii="Arial" w:eastAsia="Arial" w:hAnsi="Arial" w:cs="Arial"/>
-                <w:color w:val="1A5276"/>
-                <w:sz w:val="18"/>
-                <w:szCs w:val="18"/>
-              </w:rPr>
-              <w:t>@gmail.com</w:t>
+              <w:t>Rayan45ahmed.khan@gmail.com</w:t>
             </w:r>
             <w:r>
               <w:rPr>
@@ -141,7 +120,44 @@
                 <w:sz w:val="18"/>
                 <w:szCs w:val="18"/>
               </w:rPr>
-              <w:t>+</w:t>
+              <w:t>+0310 - 2079916</w:t>
+            </w:r>
+            <w:r>
+              <w:rPr>
+                <w:rFonts w:ascii="Arial" w:eastAsia="Arial" w:hAnsi="Arial" w:cs="Arial"/>
+                <w:color w:val="555555"/>
+                <w:sz w:val="18"/>
+                <w:szCs w:val="18"/>
+              </w:rPr>
+              <w:t xml:space="preserve">   |</w:t>
+            </w:r>
+            <w:r>
+              <w:rPr>
+                <w:rFonts w:ascii="Arial" w:eastAsia="Arial" w:hAnsi="Arial" w:cs="Arial"/>
+                <w:color w:val="555555"/>
+                <w:sz w:val="18"/>
+                <w:szCs w:val="18"/>
+              </w:rPr>
+              <w:t xml:space="preserve">   </w:t>
+            </w:r>
+            <w:hyperlink r:id="rId5" w:history="1">
+              <w:r>
+                <w:rPr>
+                  <w:color w:val="1A5276"/>
+                  <w:sz w:val="18"/>
+                  <w:szCs w:val="18"/>
+                </w:rPr>
+                <w:t>https://rayan45ahmedkhan-beep.github.io/Rayyan-Projects</w:t>
+              </w:r>
+            </w:hyperlink>
+            <w:r>
+              <w:rPr>
+                <w:rFonts w:ascii="Arial" w:eastAsia="Arial" w:hAnsi="Arial" w:cs="Arial"/>
+                <w:color w:val="1A5276"/>
+                <w:sz w:val="16"/>
+                <w:szCs w:val="16"/>
+              </w:rPr>
+              <w:t xml:space="preserve"> </w:t>
             </w:r>
             <w:r>
               <w:rPr>
@@ -150,7 +166,7 @@
                 <w:sz w:val="18"/>
                 <w:szCs w:val="18"/>
               </w:rPr>
-              <w:t>0310 - 2079916</w:t>
+              <w:t xml:space="preserve"> </w:t>
             </w:r>
             <w:r>
               <w:rPr>
@@ -159,7 +175,25 @@
                 <w:sz w:val="18"/>
                 <w:szCs w:val="18"/>
               </w:rPr>
-              <w:t xml:space="preserve">   |   </w:t>
+              <w:t xml:space="preserve">  </w:t>
+            </w:r>
+            <w:r>
+              <w:rPr>
+                <w:rFonts w:ascii="Arial" w:eastAsia="Arial" w:hAnsi="Arial" w:cs="Arial"/>
+                <w:color w:val="555555"/>
+                <w:sz w:val="18"/>
+                <w:szCs w:val="18"/>
+              </w:rPr>
+              <w:t>|</w:t>
+            </w:r>
+            <w:r>
+              <w:rPr>
+                <w:rFonts w:ascii="Arial" w:eastAsia="Arial" w:hAnsi="Arial" w:cs="Arial"/>
+                <w:color w:val="555555"/>
+                <w:sz w:val="18"/>
+                <w:szCs w:val="18"/>
+              </w:rPr>
+              <w:t xml:space="preserve">   </w:t>
             </w:r>
             <w:r>
               <w:rPr>
@@ -177,28 +211,8 @@
                 <w:sz w:val="18"/>
                 <w:szCs w:val="18"/>
               </w:rPr>
-              <w:t xml:space="preserve">   |   </w:t>
+              <w:t xml:space="preserve">   </w:t>
             </w:r>
-            <w:r>
-              <w:rPr>
-                <w:rFonts w:ascii="Arial" w:eastAsia="Arial" w:hAnsi="Arial" w:cs="Arial"/>
-                <w:color w:val="1A5276"/>
-                <w:sz w:val="18"/>
-                <w:szCs w:val="18"/>
-              </w:rPr>
-              <w:t>github.com/</w:t>
-            </w:r>
-            <w:proofErr w:type="spellStart"/>
-            <w:r>
-              <w:rPr>
-                <w:rFonts w:ascii="Arial" w:eastAsia="Arial" w:hAnsi="Arial" w:cs="Arial"/>
-                <w:color w:val="1A5276"/>
-                <w:sz w:val="18"/>
-                <w:szCs w:val="18"/>
-              </w:rPr>
-              <w:t>yourusername</w:t>
-            </w:r>
-            <w:proofErr w:type="spellEnd"/>
           </w:p>
         </w:tc>
       </w:tr>
@@ -273,15 +287,7 @@
           <w:b/>
           <w:bCs/>
         </w:rPr>
-        <w:t>Matric — The</w:t>
-      </w:r>
-      <w:r>
-        <w:rPr>
-          <w:rFonts w:ascii="Arial" w:eastAsia="Arial" w:hAnsi="Arial" w:cs="Arial"/>
-          <w:b/>
-          <w:bCs/>
-        </w:rPr>
-        <w:t xml:space="preserve"> Vision School</w:t>
+        <w:t>Matric — The Vision School</w:t>
       </w:r>
       <w:r>
         <w:rPr>
@@ -359,12 +365,6 @@
         <w:gridCol w:w="3707"/>
       </w:tblGrid>
       <w:tr>
-        <w:tblPrEx>
-          <w:tblCellMar>
-            <w:top w:w="0" w:type="dxa"/>
-            <w:bottom w:w="0" w:type="dxa"/>
-          </w:tblCellMar>
-        </w:tblPrEx>
         <w:tc>
           <w:tcPr>
             <w:tcW w:w="0" w:type="auto"/>
@@ -493,12 +493,6 @@
         </w:tc>
       </w:tr>
       <w:tr>
-        <w:tblPrEx>
-          <w:tblCellMar>
-            <w:top w:w="0" w:type="dxa"/>
-            <w:bottom w:w="0" w:type="dxa"/>
-          </w:tblCellMar>
-        </w:tblPrEx>
         <w:tc>
           <w:tcPr>
             <w:tcW w:w="0" w:type="auto"/>
@@ -518,12 +512,6 @@
         </w:tc>
       </w:tr>
       <w:tr>
-        <w:tblPrEx>
-          <w:tblCellMar>
-            <w:top w:w="0" w:type="dxa"/>
-            <w:bottom w:w="0" w:type="dxa"/>
-          </w:tblCellMar>
-        </w:tblPrEx>
         <w:tc>
           <w:tcPr>
             <w:tcW w:w="0" w:type="auto"/>
@@ -652,12 +640,6 @@
         </w:tc>
       </w:tr>
       <w:tr>
-        <w:tblPrEx>
-          <w:tblCellMar>
-            <w:top w:w="0" w:type="dxa"/>
-            <w:bottom w:w="0" w:type="dxa"/>
-          </w:tblCellMar>
-        </w:tblPrEx>
         <w:tc>
           <w:tcPr>
             <w:tcW w:w="0" w:type="auto"/>
@@ -677,12 +659,6 @@
         </w:tc>
       </w:tr>
       <w:tr>
-        <w:tblPrEx>
-          <w:tblCellMar>
-            <w:top w:w="0" w:type="dxa"/>
-            <w:bottom w:w="0" w:type="dxa"/>
-          </w:tblCellMar>
-        </w:tblPrEx>
         <w:tc>
           <w:tcPr>
             <w:tcW w:w="0" w:type="auto"/>
@@ -984,39 +960,15 @@
     </w:p>
     <w:p>
       <w:pPr>
-        <w:spacing w:before="80"/>
-      </w:pPr>
-    </w:p>
-    <w:p>
-      <w:pPr>
-        <w:pBdr>
-          <w:bottom w:val="single" w:sz="8" w:space="4" w:color="1A5276"/>
-        </w:pBdr>
-        <w:spacing w:before="240" w:after="80"/>
+        <w:spacing w:before="40" w:after="20"/>
       </w:pPr>
       <w:r>
         <w:rPr>
           <w:rFonts w:ascii="Arial" w:eastAsia="Arial" w:hAnsi="Arial" w:cs="Arial"/>
           <w:b/>
           <w:bCs/>
-          <w:color w:val="1A5276"/>
-          <w:sz w:val="24"/>
-          <w:szCs w:val="24"/>
-        </w:rPr>
-        <w:t>SKILLS OVERVIEW</w:t>
-      </w:r>
-    </w:p>
-    <w:p>
-      <w:pPr>
-        <w:spacing w:before="80" w:after="40"/>
-      </w:pPr>
-      <w:r>
-        <w:rPr>
-          <w:rFonts w:ascii="Arial" w:eastAsia="Arial" w:hAnsi="Arial" w:cs="Arial"/>
-          <w:b/>
-          <w:bCs/>
-        </w:rPr>
-        <w:t>Front-End Development:</w:t>
+        </w:rPr>
+        <w:t>Jenson Decor Website</w:t>
       </w:r>
     </w:p>
     <w:p>
@@ -1033,7 +985,66 @@
           <w:rFonts w:ascii="Arial" w:eastAsia="Arial" w:hAnsi="Arial" w:cs="Arial"/>
           <w:color w:val="555555"/>
         </w:rPr>
-        <w:t>HTML5 — Semantic markup, forms, accessibility best practices</w:t>
+        <w:t xml:space="preserve">Built a </w:t>
+      </w:r>
+      <w:r>
+        <w:rPr>
+          <w:rFonts w:ascii="Arial" w:eastAsia="Arial" w:hAnsi="Arial" w:cs="Arial"/>
+          <w:color w:val="555555"/>
+        </w:rPr>
+        <w:t>Jenson Wall Decor</w:t>
+      </w:r>
+      <w:r>
+        <w:rPr>
+          <w:rFonts w:ascii="Arial" w:eastAsia="Arial" w:hAnsi="Arial" w:cs="Arial"/>
+          <w:color w:val="555555"/>
+        </w:rPr>
+        <w:t xml:space="preserve"> using HTML, CSS and JavaScript</w:t>
+      </w:r>
+      <w:r>
+        <w:rPr>
+          <w:rFonts w:ascii="Arial" w:eastAsia="Arial" w:hAnsi="Arial" w:cs="Arial"/>
+          <w:color w:val="555555"/>
+        </w:rPr>
+        <w:t xml:space="preserve"> having products detail, compare and word document download features</w:t>
+      </w:r>
+    </w:p>
+    <w:p>
+      <w:pPr>
+        <w:spacing w:before="80"/>
+      </w:pPr>
+    </w:p>
+    <w:p>
+      <w:pPr>
+        <w:pBdr>
+          <w:bottom w:val="single" w:sz="8" w:space="4" w:color="1A5276"/>
+        </w:pBdr>
+        <w:spacing w:before="240" w:after="80"/>
+      </w:pPr>
+      <w:r>
+        <w:rPr>
+          <w:rFonts w:ascii="Arial" w:eastAsia="Arial" w:hAnsi="Arial" w:cs="Arial"/>
+          <w:b/>
+          <w:bCs/>
+          <w:color w:val="1A5276"/>
+          <w:sz w:val="24"/>
+          <w:szCs w:val="24"/>
+        </w:rPr>
+        <w:t>SKILLS OVERVIEW</w:t>
+      </w:r>
+    </w:p>
+    <w:p>
+      <w:pPr>
+        <w:spacing w:before="80" w:after="40"/>
+      </w:pPr>
+      <w:r>
+        <w:rPr>
+          <w:rFonts w:ascii="Arial" w:eastAsia="Arial" w:hAnsi="Arial" w:cs="Arial"/>
+          <w:b/>
+          <w:bCs/>
+        </w:rPr>
+        <w:lastRenderedPageBreak/>
+        <w:t>Front-End Development:</w:t>
       </w:r>
     </w:p>
     <w:p>
@@ -1050,7 +1061,7 @@
           <w:rFonts w:ascii="Arial" w:eastAsia="Arial" w:hAnsi="Arial" w:cs="Arial"/>
           <w:color w:val="555555"/>
         </w:rPr>
-        <w:t>CSS3 — Flexbox, Grid, animations, responsive design</w:t>
+        <w:t>HTML5 — Semantic markup, forms, accessibility best practices</w:t>
       </w:r>
     </w:p>
     <w:p>
@@ -1067,7 +1078,7 @@
           <w:rFonts w:ascii="Arial" w:eastAsia="Arial" w:hAnsi="Arial" w:cs="Arial"/>
           <w:color w:val="555555"/>
         </w:rPr>
-        <w:t>JavaScript — DOM manipulation, events, ES6+ basics</w:t>
+        <w:t>CSS3 — Flexbox, Grid, animations, responsive design</w:t>
       </w:r>
     </w:p>
     <w:p>
@@ -1084,7 +1095,23 @@
           <w:rFonts w:ascii="Arial" w:eastAsia="Arial" w:hAnsi="Arial" w:cs="Arial"/>
           <w:color w:val="555555"/>
         </w:rPr>
-        <w:lastRenderedPageBreak/>
+        <w:t>JavaScript — DOM manipulation, events, ES6+ basics</w:t>
+      </w:r>
+    </w:p>
+    <w:p>
+      <w:pPr>
+        <w:pStyle w:val="ListParagraph"/>
+        <w:numPr>
+          <w:ilvl w:val="0"/>
+          <w:numId w:val="2"/>
+        </w:numPr>
+        <w:spacing w:before="40" w:after="40"/>
+      </w:pPr>
+      <w:r>
+        <w:rPr>
+          <w:rFonts w:ascii="Arial" w:eastAsia="Arial" w:hAnsi="Arial" w:cs="Arial"/>
+          <w:color w:val="555555"/>
+        </w:rPr>
         <w:t>Bootstrap — Responsive grid, components, utility classes</w:t>
       </w:r>
     </w:p>
@@ -1946,7 +1973,6 @@
   <w:style w:type="character" w:default="1" w:styleId="DefaultParagraphFont">
     <w:name w:val="Default Paragraph Font"/>
     <w:uiPriority w:val="1"/>
-    <w:semiHidden/>
     <w:unhideWhenUsed/>
   </w:style>
   <w:style w:type="table" w:default="1" w:styleId="TableNormal">
@@ -2052,6 +2078,18 @@
     <w:rPr>
       <w:sz w:val="20"/>
       <w:szCs w:val="20"/>
+    </w:rPr>
+  </w:style>
+  <w:style w:type="character" w:styleId="UnresolvedMention">
+    <w:name w:val="Unresolved Mention"/>
+    <w:basedOn w:val="DefaultParagraphFont"/>
+    <w:uiPriority w:val="99"/>
+    <w:semiHidden/>
+    <w:unhideWhenUsed/>
+    <w:rsid w:val="00FE0D6A"/>
+    <w:rPr>
+      <w:color w:val="605E5C"/>
+      <w:shd w:val="clear" w:color="auto" w:fill="E1DFDD"/>
     </w:rPr>
   </w:style>
 </w:styles>

</xml_diff>